<commit_message>
updated portable build with IEC 61850 auto-fetch feature
</commit_message>
<xml_diff>
--- a/Protection_RCA_User_Guide.docx
+++ b/Protection_RCA_User_Guide.docx
@@ -1942,6 +1942,34 @@
                 <w:sz w:val="18"/>
               </w:rPr>
               <w:t>RCA / protection rule catalogs</w:t>
+            </w:r>
+          </w:p>
+        </w:tc>
+      </w:tr>
+      <w:tr>
+        <w:tc>
+          <w:tcPr>
+            <w:tcW w:type="dxa" w:w="4680"/>
+          </w:tcPr>
+          <w:p>
+            <w:r>
+              <w:rPr>
+                <w:sz w:val="18"/>
+              </w:rPr>
+              <w:t>templates\</w:t>
+            </w:r>
+          </w:p>
+        </w:tc>
+        <w:tc>
+          <w:tcPr>
+            <w:tcW w:type="dxa" w:w="4680"/>
+          </w:tcPr>
+          <w:p>
+            <w:r>
+              <w:rPr>
+                <w:sz w:val="18"/>
+              </w:rPr>
+              <w:t>Report template and controlled sentence library (needed for HTML/PDF reports)</w:t>
             </w:r>
           </w:p>
         </w:tc>
@@ -18984,6 +19012,34 @@
                 <w:sz w:val="18"/>
               </w:rPr>
               <w:t>Ensure reportlab installed in backend env (included in portable build)</w:t>
+            </w:r>
+          </w:p>
+        </w:tc>
+      </w:tr>
+      <w:tr>
+        <w:tc>
+          <w:tcPr>
+            <w:tcW w:type="dxa" w:w="4680"/>
+          </w:tcPr>
+          <w:p>
+            <w:r>
+              <w:rPr>
+                <w:sz w:val="18"/>
+              </w:rPr>
+              <w:t>Report shows “Report template NOT AVAILABLE”</w:t>
+            </w:r>
+          </w:p>
+        </w:tc>
+        <w:tc>
+          <w:tcPr>
+            <w:tcW w:type="dxa" w:w="4680"/>
+          </w:tcPr>
+          <w:p>
+            <w:r>
+              <w:rPr>
+                <w:sz w:val="18"/>
+              </w:rPr>
+              <w:t>The templates\ folder is missing next to backend\ (portable folders built before this fix). Rebuild portable-share or copy protection-rca\templates into it, restart the exe, then click Refresh report</w:t>
             </w:r>
           </w:p>
         </w:tc>

</xml_diff>